<commit_message>
Retirar la marca SolTech Energy de informes, presupuesto, ficha técnica y manual (se conserva solo como marca del catálogo FV)
</commit_message>
<xml_diff>
--- a/entregables/FICHA_TECNICA_CALCULADORA_BIPV_agosto2026.docx
+++ b/entregables/FICHA_TECNICA_CALCULADORA_BIPV_agosto2026.docx
@@ -41,7 +41,7 @@
           <w:color w:val="37474F"/>
           <w:sz w:val="19"/>
         </w:rPr>
-        <w:t>Innovación Química / SolTech Energy  ·  calc.innovacionquimica.com.co  ·  Versión agosto 2026</w:t>
+        <w:t>Innovación Química  ·  calc.innovacionquimica.com.co  ·  Versión agosto 2026</w:t>
       </w:r>
     </w:p>
     <w:tbl>
@@ -1040,7 +1040,7 @@
           <w:color w:val="37474F"/>
           <w:sz w:val="17"/>
         </w:rPr>
-        <w:t>Ficha técnica — agosto de 2026 · Innovación Química / SolTech Energy</w:t>
+        <w:t>Ficha técnica — agosto de 2026 · Innovación Química</w:t>
       </w:r>
     </w:p>
     <w:sectPr>

</xml_diff>

<commit_message>
Ficha técnica extendida: datos contundentes del manual (bypass, PR, benchmarks Colombia, Ley 1715, trazabilidad)
</commit_message>
<xml_diff>
--- a/entregables/FICHA_TECNICA_CALCULADORA_BIPV_agosto2026.docx
+++ b/entregables/FICHA_TECNICA_CALCULADORA_BIPV_agosto2026.docx
@@ -25,23 +25,23 @@
         <w:rPr>
           <w:b/>
           <w:color w:val="37474F"/>
-          <w:sz w:val="26"/>
+          <w:sz w:val="25"/>
         </w:rPr>
-        <w:t>Calculadora BIPV — Simulación fotovoltaica integrada en edificios y agrivoltaica</w:t>
+        <w:t>Calculadora BIPV — Plataforma de simulación fotovoltaica integrada en edificios y agrivoltaica</w:t>
       </w:r>
     </w:p>
     <w:p>
       <w:pPr>
-        <w:spacing w:after="200"/>
+        <w:spacing w:after="160"/>
         <w:jc w:val="center"/>
       </w:pPr>
       <w:r>
         <w:rPr>
           <w:b w:val="0"/>
           <w:color w:val="37474F"/>
-          <w:sz w:val="19"/>
+          <w:sz w:val="18"/>
         </w:rPr>
-        <w:t>Innovación Química  ·  calc.innovacionquimica.com.co  ·  Versión agosto 2026</w:t>
+        <w:t>Innovación Química · calc.innovacionquimica.com.co · Versión agosto 2026</w:t>
       </w:r>
     </w:p>
     <w:tbl>
@@ -51,12 +51,12 @@
         <w:tblLook w:firstColumn="1" w:firstRow="1" w:lastColumn="0" w:lastRow="0" w:noHBand="0" w:noVBand="1" w:val="04A0"/>
       </w:tblPr>
       <w:tblGrid>
-        <w:gridCol w:w="10200"/>
+        <w:gridCol w:w="10312"/>
       </w:tblGrid>
       <w:tr>
         <w:tc>
           <w:tcPr>
-            <w:tcW w:type="dxa" w:w="10200"/>
+            <w:tcW w:type="dxa" w:w="10312"/>
             <w:shd w:val="clear" w:color="auto" w:fill="E3F2FD"/>
           </w:tcPr>
           <w:p>
@@ -64,16 +64,16 @@
               <w:rPr>
                 <w:b/>
                 <w:color w:val="0D47A1"/>
-                <w:sz w:val="21"/>
+                <w:sz w:val="20"/>
               </w:rPr>
-              <w:t xml:space="preserve">¿Por qué es diferente? </w:t>
+              <w:t xml:space="preserve">¿Qué es? </w:t>
             </w:r>
             <w:r>
               <w:rPr>
                 <w:color w:val="0D47A1"/>
-                <w:sz w:val="21"/>
+                <w:sz w:val="20"/>
               </w:rPr>
-              <w:t>La única herramienta en Colombia que simula fachadas BIPV, cubiertas, pérgolas y granjas agrivoltaicas con física de nivel bancable: 8 760 horas de simulación real, curva IV completa del panel, sombras con diodos de bypass y análisis financiero en COP con TRM en línea. No es una regla de tres: es un laboratorio solar.</w:t>
+              <w:t>Simula 8 760 horas del año con datos climáticos reales del sitio, resuelve la curva corriente-voltaje de cada panel, modela la activación de los diodos de bypass bajo sombra parcial y entrega TIR, VPN, Payback y LCOE en pesos colombianos con la Ley 1715/2014 aplicada. Cada número del reporte es trazable y auditable — del rayo de sol al flujo de caja.</w:t>
             </w:r>
           </w:p>
         </w:tc>
@@ -81,7 +81,7 @@
     </w:tbl>
     <w:p>
       <w:pPr>
-        <w:spacing w:after="40"/>
+        <w:spacing w:after="20"/>
       </w:pPr>
     </w:p>
     <w:p>
@@ -94,145 +94,19 @@
           <w:color w:val="0D47A1"/>
           <w:sz w:val="26"/>
         </w:rPr>
-        <w:t>1. Motores de cálculo — el corazón de la herramienta</w:t>
+        <w:t>1. Seis tecnologías de integración, cada una con su física correcta</w:t>
       </w:r>
     </w:p>
     <w:p>
       <w:pPr>
-        <w:spacing w:after="40"/>
-      </w:pPr>
-      <w:r>
-        <w:rPr>
-          <w:b/>
-          <w:color w:val="1B5E20"/>
-          <w:sz w:val="21"/>
-        </w:rPr>
-        <w:t>☀️ Recurso solar hora a hora (8 760 h/año)</w:t>
-      </w:r>
-    </w:p>
-    <w:p>
-      <w:pPr>
-        <w:spacing w:after="120"/>
+        <w:spacing w:after="100"/>
       </w:pPr>
       <w:r>
         <w:rPr>
           <w:b w:val="0"/>
-          <w:sz w:val="21"/>
+          <w:sz w:val="20"/>
         </w:rPr>
-        <w:t>Consume archivos climáticos TMY/EPW reales de la ubicación y calcula la irradiancia en el plano exacto de instalación (POA) con el modelo de transposición Hay-Davies, incluyendo heatmap horario y diagrama de trayectoria solar. Para sistemas bifaciales y agrivoltaicos aplica el modelo infinite_sheds (pvlib), que captura la luz que llega a la cara trasera del panel según la separación real entre filas (GCR).</w:t>
-      </w:r>
-    </w:p>
-    <w:p>
-      <w:pPr>
-        <w:spacing w:after="40"/>
-      </w:pPr>
-      <w:r>
-        <w:rPr>
-          <w:b/>
-          <w:color w:val="1B5E20"/>
-          <w:sz w:val="21"/>
-        </w:rPr>
-        <w:t>⚡ Motor IV — curva corriente-voltaje real del panel</w:t>
-      </w:r>
-    </w:p>
-    <w:p>
-      <w:pPr>
-        <w:spacing w:after="120"/>
-      </w:pPr>
-      <w:r>
-        <w:rPr>
-          <w:b w:val="0"/>
-          <w:sz w:val="21"/>
-        </w:rPr>
-        <w:t>Mientras otras herramientas multiplican Wp × horas de sol, la Calculadora resuelve el modelo de diodo único del panel en cada condición de irradiancia y temperatura: Voc, Isc, punto de máxima potencia y coeficientes térmicos reales de la ficha técnica. Se activa automáticamente cuando el panel tiene ficha completa e incluye defensa contra el error más común del mercado: el conteo de celdas en paneles half-cut (verificación Ns ≈ Voc/0.74).</w:t>
-      </w:r>
-    </w:p>
-    <w:p>
-      <w:pPr>
-        <w:spacing w:after="40"/>
-      </w:pPr>
-      <w:r>
-        <w:rPr>
-          <w:b/>
-          <w:color w:val="1B5E20"/>
-          <w:sz w:val="21"/>
-        </w:rPr>
-        <w:t>🌗 Sombras con diodos de bypass — el diferencial técnico</w:t>
-      </w:r>
-    </w:p>
-    <w:p>
-      <w:pPr>
-        <w:spacing w:after="120"/>
-      </w:pPr>
-      <w:r>
-        <w:rPr>
-          <w:b w:val="0"/>
-          <w:sz w:val="21"/>
-        </w:rPr>
-        <w:t>En BIPV urbano la sombra parcial es la regla, no la excepción. El motor de mismatch simula el comportamiento eléctrico real del string bajo sombra: qué diodos de bypass se activan, cuánta potencia se recupera y cuánta se pierde de verdad — no un descuento porcentual arbitrario. Se alimenta de la Calculadora de Sombreado 3D (factor de sombra horario por punto de análisis).</w:t>
-      </w:r>
-    </w:p>
-    <w:p>
-      <w:pPr>
-        <w:spacing w:after="40"/>
-      </w:pPr>
-      <w:r>
-        <w:rPr>
-          <w:b/>
-          <w:color w:val="1B5E20"/>
-          <w:sz w:val="21"/>
-        </w:rPr>
-        <w:t>🔬 Motor Óptico BIPV</w:t>
-      </w:r>
-    </w:p>
-    <w:p>
-      <w:pPr>
-        <w:spacing w:after="120"/>
-      </w:pPr>
-      <w:r>
-        <w:rPr>
-          <w:b w:val="0"/>
-          <w:sz w:val="21"/>
-        </w:rPr>
-        <w:t>Pérdidas que solo existen en integración arquitectónica y que las herramientas genéricas ignoran: reflexión por ángulo de incidencia (IAM), suciedad (soiling) y el efecto térmico del confinamiento en fachada, donde el panel opera más caliente que en un rack ventilado.</w:t>
-      </w:r>
-    </w:p>
-    <w:p>
-      <w:pPr>
-        <w:spacing w:after="40"/>
-      </w:pPr>
-      <w:r>
-        <w:rPr>
-          <w:b/>
-          <w:color w:val="1B5E20"/>
-          <w:sz w:val="21"/>
-        </w:rPr>
-        <w:t>🌱 Agrivoltaica — cultivo y energía en el mismo terreno</w:t>
-      </w:r>
-    </w:p>
-    <w:p>
-      <w:pPr>
-        <w:spacing w:after="120"/>
-      </w:pPr>
-      <w:r>
-        <w:rPr>
-          <w:b w:val="0"/>
-          <w:sz w:val="21"/>
-        </w:rPr>
-        <w:t>Factor de ocupación configurable (5–100%): la herramienta dimensiona paneles, presupuesto y USD/m² sobre el área útil, sincroniza la separación entre filas (GCR) con ese factor y lo muestra en una Vista 3D con las filas elevadas a 3 m sobre el cultivo. Diseñada y validada con proyectos reales de cultivo bajo paneles en Colombia.</w:t>
-      </w:r>
-    </w:p>
-    <w:p>
-      <w:pPr>
-        <w:spacing w:after="80"/>
-      </w:pPr>
-      <w:r>
-        <w:rPr>
-          <w:b/>
-          <w:color w:val="0D47A1"/>
-          <w:sz w:val="26"/>
-        </w:rPr>
-        <w:t>2. Cadena de simulación completa</w:t>
+        <w:t>La Calculadora no usa un modelo genérico: cada tipo de instalación carga automáticamente su densidad de potencia, su Performance Ratio típico y su inclinación físicamente correcta, con alertas reactivas si un valor sale del rango recomendado.</w:t>
       </w:r>
     </w:p>
     <w:tbl>
@@ -243,14 +117,16 @@
         <w:tblLook w:firstColumn="1" w:firstRow="1" w:lastColumn="0" w:lastRow="0" w:noHBand="0" w:noVBand="1" w:val="04A0"/>
       </w:tblPr>
       <w:tblGrid>
-        <w:gridCol w:w="3400"/>
-        <w:gridCol w:w="3400"/>
-        <w:gridCol w:w="3400"/>
+        <w:gridCol w:w="2062"/>
+        <w:gridCol w:w="2062"/>
+        <w:gridCol w:w="2062"/>
+        <w:gridCol w:w="2062"/>
+        <w:gridCol w:w="2062"/>
       </w:tblGrid>
       <w:tr>
         <w:tc>
           <w:tcPr>
-            <w:tcW w:type="dxa" w:w="3400"/>
+            <w:tcW w:type="dxa" w:w="2062"/>
             <w:shd w:val="clear" w:color="auto" w:fill="1B5E20"/>
           </w:tcPr>
           <w:p>
@@ -258,15 +134,15 @@
               <w:rPr>
                 <w:b/>
                 <w:color w:val="FFFFFF"/>
-                <w:sz w:val="20"/>
+                <w:sz w:val="19"/>
               </w:rPr>
-              <w:t>Etapa</w:t>
+              <w:t>Tipo de instalación</w:t>
             </w:r>
           </w:p>
         </w:tc>
         <w:tc>
           <w:tcPr>
-            <w:tcW w:type="dxa" w:w="3400"/>
+            <w:tcW w:type="dxa" w:w="2062"/>
             <w:shd w:val="clear" w:color="auto" w:fill="1B5E20"/>
           </w:tcPr>
           <w:p>
@@ -274,15 +150,15 @@
               <w:rPr>
                 <w:b/>
                 <w:color w:val="FFFFFF"/>
-                <w:sz w:val="20"/>
+                <w:sz w:val="19"/>
               </w:rPr>
-              <w:t>Modelo / método</w:t>
+              <w:t>Densidad (W/m²)</w:t>
             </w:r>
           </w:p>
         </w:tc>
         <w:tc>
           <w:tcPr>
-            <w:tcW w:type="dxa" w:w="3400"/>
+            <w:tcW w:type="dxa" w:w="2062"/>
             <w:shd w:val="clear" w:color="auto" w:fill="1B5E20"/>
           </w:tcPr>
           <w:p>
@@ -290,9 +166,41 @@
               <w:rPr>
                 <w:b/>
                 <w:color w:val="FFFFFF"/>
-                <w:sz w:val="20"/>
+                <w:sz w:val="19"/>
               </w:rPr>
-              <w:t>Lo que garantiza</w:t>
+              <w:t>PR típico</w:t>
+            </w:r>
+          </w:p>
+        </w:tc>
+        <w:tc>
+          <w:tcPr>
+            <w:tcW w:type="dxa" w:w="2062"/>
+            <w:shd w:val="clear" w:color="auto" w:fill="1B5E20"/>
+          </w:tcPr>
+          <w:p>
+            <w:r>
+              <w:rPr>
+                <w:b/>
+                <w:color w:val="FFFFFF"/>
+                <w:sz w:val="19"/>
+              </w:rPr>
+              <w:t>Tilt defecto</w:t>
+            </w:r>
+          </w:p>
+        </w:tc>
+        <w:tc>
+          <w:tcPr>
+            <w:tcW w:type="dxa" w:w="2062"/>
+            <w:shd w:val="clear" w:color="auto" w:fill="1B5E20"/>
+          </w:tcPr>
+          <w:p>
+            <w:r>
+              <w:rPr>
+                <w:b/>
+                <w:color w:val="FFFFFF"/>
+                <w:sz w:val="19"/>
+              </w:rPr>
+              <w:t>Modelo térmico</w:t>
             </w:r>
           </w:p>
         </w:tc>
@@ -300,41 +208,67 @@
       <w:tr>
         <w:tc>
           <w:tcPr>
-            <w:tcW w:type="dxa" w:w="3400"/>
+            <w:tcW w:type="dxa" w:w="2062"/>
           </w:tcPr>
           <w:p>
             <w:r>
               <w:rPr>
                 <w:b/>
-                <w:sz w:val="19"/>
+                <w:sz w:val="18"/>
               </w:rPr>
-              <w:t>Recurso solar</w:t>
+              <w:t>🏢 Fachada BIPV</w:t>
             </w:r>
           </w:p>
         </w:tc>
         <w:tc>
           <w:tcPr>
-            <w:tcW w:type="dxa" w:w="3400"/>
+            <w:tcW w:type="dxa" w:w="2062"/>
           </w:tcPr>
           <w:p>
             <w:r>
               <w:rPr>
-                <w:sz w:val="19"/>
+                <w:sz w:val="18"/>
               </w:rPr>
-              <w:t>TMY/EPW + Hay-Davies + infinite_sheds (pvlib)</w:t>
+              <w:t>80–180</w:t>
             </w:r>
           </w:p>
         </w:tc>
         <w:tc>
           <w:tcPr>
-            <w:tcW w:type="dxa" w:w="3400"/>
+            <w:tcW w:type="dxa" w:w="2062"/>
           </w:tcPr>
           <w:p>
             <w:r>
               <w:rPr>
-                <w:sz w:val="19"/>
+                <w:sz w:val="18"/>
               </w:rPr>
-              <w:t>Irradiancia real del sitio, no promedios nacionales</w:t>
+              <w:t>0.65</w:t>
+            </w:r>
+          </w:p>
+        </w:tc>
+        <w:tc>
+          <w:tcPr>
+            <w:tcW w:type="dxa" w:w="2062"/>
+          </w:tcPr>
+          <w:p>
+            <w:r>
+              <w:rPr>
+                <w:sz w:val="18"/>
+              </w:rPr>
+              <w:t>90°</w:t>
+            </w:r>
+          </w:p>
+        </w:tc>
+        <w:tc>
+          <w:tcPr>
+            <w:tcW w:type="dxa" w:w="2062"/>
+          </w:tcPr>
+          <w:p>
+            <w:r>
+              <w:rPr>
+                <w:sz w:val="18"/>
+              </w:rPr>
+              <w:t>Confinado (k=1.3)</w:t>
             </w:r>
           </w:p>
         </w:tc>
@@ -342,44 +276,72 @@
       <w:tr>
         <w:tc>
           <w:tcPr>
-            <w:tcW w:type="dxa" w:w="3400"/>
+            <w:tcW w:type="dxa" w:w="2062"/>
             <w:shd w:val="clear" w:color="auto" w:fill="E8F5E9"/>
           </w:tcPr>
           <w:p>
             <w:r>
               <w:rPr>
                 <w:b/>
-                <w:sz w:val="19"/>
+                <w:sz w:val="18"/>
               </w:rPr>
-              <w:t>Óptica BIPV</w:t>
+              <w:t>🏠 Techo inclinado BIPV</w:t>
             </w:r>
           </w:p>
         </w:tc>
         <w:tc>
           <w:tcPr>
-            <w:tcW w:type="dxa" w:w="3400"/>
+            <w:tcW w:type="dxa" w:w="2062"/>
             <w:shd w:val="clear" w:color="auto" w:fill="E8F5E9"/>
           </w:tcPr>
           <w:p>
             <w:r>
               <w:rPr>
-                <w:sz w:val="19"/>
+                <w:sz w:val="18"/>
               </w:rPr>
-              <w:t>IAM + soiling + térmica confinada</w:t>
+              <w:t>100–200</w:t>
             </w:r>
           </w:p>
         </w:tc>
         <w:tc>
           <w:tcPr>
-            <w:tcW w:type="dxa" w:w="3400"/>
+            <w:tcW w:type="dxa" w:w="2062"/>
             <w:shd w:val="clear" w:color="auto" w:fill="E8F5E9"/>
           </w:tcPr>
           <w:p>
             <w:r>
               <w:rPr>
-                <w:sz w:val="19"/>
+                <w:sz w:val="18"/>
               </w:rPr>
-              <w:t>Pérdidas de fachada que otros ignoran</w:t>
+              <w:t>0.75</w:t>
+            </w:r>
+          </w:p>
+        </w:tc>
+        <w:tc>
+          <w:tcPr>
+            <w:tcW w:type="dxa" w:w="2062"/>
+            <w:shd w:val="clear" w:color="auto" w:fill="E8F5E9"/>
+          </w:tcPr>
+          <w:p>
+            <w:r>
+              <w:rPr>
+                <w:sz w:val="18"/>
+              </w:rPr>
+              <w:t>15°</w:t>
+            </w:r>
+          </w:p>
+        </w:tc>
+        <w:tc>
+          <w:tcPr>
+            <w:tcW w:type="dxa" w:w="2062"/>
+            <w:shd w:val="clear" w:color="auto" w:fill="E8F5E9"/>
+          </w:tcPr>
+          <w:p>
+            <w:r>
+              <w:rPr>
+                <w:sz w:val="18"/>
+              </w:rPr>
+              <w:t>Ventilado (k=1.0)</w:t>
             </w:r>
           </w:p>
         </w:tc>
@@ -387,41 +349,67 @@
       <w:tr>
         <w:tc>
           <w:tcPr>
-            <w:tcW w:type="dxa" w:w="3400"/>
+            <w:tcW w:type="dxa" w:w="2062"/>
           </w:tcPr>
           <w:p>
             <w:r>
               <w:rPr>
                 <w:b/>
-                <w:sz w:val="19"/>
+                <w:sz w:val="18"/>
               </w:rPr>
-              <w:t>Eléctrica</w:t>
+              <w:t>⛱️ Pérgola BIPV</w:t>
             </w:r>
           </w:p>
         </w:tc>
         <w:tc>
           <w:tcPr>
-            <w:tcW w:type="dxa" w:w="3400"/>
+            <w:tcW w:type="dxa" w:w="2062"/>
           </w:tcPr>
           <w:p>
             <w:r>
               <w:rPr>
-                <w:sz w:val="19"/>
+                <w:sz w:val="18"/>
               </w:rPr>
-              <w:t>Diodo único (curva IV) + mismatch con bypass</w:t>
+              <w:t>60–150</w:t>
             </w:r>
           </w:p>
         </w:tc>
         <w:tc>
           <w:tcPr>
-            <w:tcW w:type="dxa" w:w="3400"/>
+            <w:tcW w:type="dxa" w:w="2062"/>
           </w:tcPr>
           <w:p>
             <w:r>
               <w:rPr>
-                <w:sz w:val="19"/>
+                <w:sz w:val="18"/>
               </w:rPr>
-              <w:t>Producción creíble bajo sombra parcial</w:t>
+              <w:t>0.70</w:t>
+            </w:r>
+          </w:p>
+        </w:tc>
+        <w:tc>
+          <w:tcPr>
+            <w:tcW w:type="dxa" w:w="2062"/>
+          </w:tcPr>
+          <w:p>
+            <w:r>
+              <w:rPr>
+                <w:sz w:val="18"/>
+              </w:rPr>
+              <w:t>10°</w:t>
+            </w:r>
+          </w:p>
+        </w:tc>
+        <w:tc>
+          <w:tcPr>
+            <w:tcW w:type="dxa" w:w="2062"/>
+          </w:tcPr>
+          <w:p>
+            <w:r>
+              <w:rPr>
+                <w:sz w:val="18"/>
+              </w:rPr>
+              <w:t>Semi-ventilado (k=1.1)</w:t>
             </w:r>
           </w:p>
         </w:tc>
@@ -429,44 +417,72 @@
       <w:tr>
         <w:tc>
           <w:tcPr>
-            <w:tcW w:type="dxa" w:w="3400"/>
+            <w:tcW w:type="dxa" w:w="2062"/>
             <w:shd w:val="clear" w:color="auto" w:fill="E8F5E9"/>
           </w:tcPr>
           <w:p>
             <w:r>
               <w:rPr>
                 <w:b/>
-                <w:sz w:val="19"/>
+                <w:sz w:val="18"/>
               </w:rPr>
-              <w:t>Dimensionamiento</w:t>
+              <w:t>Marquesina BIPV</w:t>
             </w:r>
           </w:p>
         </w:tc>
         <w:tc>
           <w:tcPr>
-            <w:tcW w:type="dxa" w:w="3400"/>
+            <w:tcW w:type="dxa" w:w="2062"/>
             <w:shd w:val="clear" w:color="auto" w:fill="E8F5E9"/>
           </w:tcPr>
           <w:p>
             <w:r>
               <w:rPr>
-                <w:sz w:val="19"/>
+                <w:sz w:val="18"/>
               </w:rPr>
-              <w:t>Emparejamiento automático panel-inversor (catálogo Growatt/Deye)</w:t>
+              <w:t>70–160</w:t>
             </w:r>
           </w:p>
         </w:tc>
         <w:tc>
           <w:tcPr>
-            <w:tcW w:type="dxa" w:w="3400"/>
+            <w:tcW w:type="dxa" w:w="2062"/>
             <w:shd w:val="clear" w:color="auto" w:fill="E8F5E9"/>
           </w:tcPr>
           <w:p>
             <w:r>
               <w:rPr>
-                <w:sz w:val="19"/>
+                <w:sz w:val="18"/>
               </w:rPr>
-              <w:t>Ventanas MPPT y ratios DC/AC verificados</w:t>
+              <w:t>0.68</w:t>
+            </w:r>
+          </w:p>
+        </w:tc>
+        <w:tc>
+          <w:tcPr>
+            <w:tcW w:type="dxa" w:w="2062"/>
+            <w:shd w:val="clear" w:color="auto" w:fill="E8F5E9"/>
+          </w:tcPr>
+          <w:p>
+            <w:r>
+              <w:rPr>
+                <w:sz w:val="18"/>
+              </w:rPr>
+              <w:t>30°</w:t>
+            </w:r>
+          </w:p>
+        </w:tc>
+        <w:tc>
+          <w:tcPr>
+            <w:tcW w:type="dxa" w:w="2062"/>
+            <w:shd w:val="clear" w:color="auto" w:fill="E8F5E9"/>
+          </w:tcPr>
+          <w:p>
+            <w:r>
+              <w:rPr>
+                <w:sz w:val="18"/>
+              </w:rPr>
+              <w:t>Semi-ventilado (k=1.1)</w:t>
             </w:r>
           </w:p>
         </w:tc>
@@ -474,41 +490,67 @@
       <w:tr>
         <w:tc>
           <w:tcPr>
-            <w:tcW w:type="dxa" w:w="3400"/>
+            <w:tcW w:type="dxa" w:w="2062"/>
           </w:tcPr>
           <w:p>
             <w:r>
               <w:rPr>
                 <w:b/>
-                <w:sz w:val="19"/>
+                <w:sz w:val="18"/>
               </w:rPr>
-              <w:t>Producción</w:t>
+              <w:t>🏚️ Techo plano</w:t>
             </w:r>
           </w:p>
         </w:tc>
         <w:tc>
           <w:tcPr>
-            <w:tcW w:type="dxa" w:w="3400"/>
+            <w:tcW w:type="dxa" w:w="2062"/>
           </w:tcPr>
           <w:p>
             <w:r>
               <w:rPr>
-                <w:sz w:val="19"/>
+                <w:sz w:val="18"/>
               </w:rPr>
-              <w:t>8 760 h con PR resultante, no asumido</w:t>
+              <w:t>120–220</w:t>
             </w:r>
           </w:p>
         </w:tc>
         <w:tc>
           <w:tcPr>
-            <w:tcW w:type="dxa" w:w="3400"/>
+            <w:tcW w:type="dxa" w:w="2062"/>
           </w:tcPr>
           <w:p>
             <w:r>
               <w:rPr>
-                <w:sz w:val="19"/>
+                <w:sz w:val="18"/>
               </w:rPr>
-              <w:t>E_ac anual defendible ante un banco</w:t>
+              <w:t>0.78</w:t>
+            </w:r>
+          </w:p>
+        </w:tc>
+        <w:tc>
+          <w:tcPr>
+            <w:tcW w:type="dxa" w:w="2062"/>
+          </w:tcPr>
+          <w:p>
+            <w:r>
+              <w:rPr>
+                <w:sz w:val="18"/>
+              </w:rPr>
+              <w:t>10°</w:t>
+            </w:r>
+          </w:p>
+        </w:tc>
+        <w:tc>
+          <w:tcPr>
+            <w:tcW w:type="dxa" w:w="2062"/>
+          </w:tcPr>
+          <w:p>
+            <w:r>
+              <w:rPr>
+                <w:sz w:val="18"/>
+              </w:rPr>
+              <w:t>Ventilado (k=1.0)</w:t>
             </w:r>
           </w:p>
         </w:tc>
@@ -516,131 +558,72 @@
       <w:tr>
         <w:tc>
           <w:tcPr>
-            <w:tcW w:type="dxa" w:w="3400"/>
+            <w:tcW w:type="dxa" w:w="2062"/>
             <w:shd w:val="clear" w:color="auto" w:fill="E8F5E9"/>
           </w:tcPr>
           <w:p>
             <w:r>
               <w:rPr>
                 <w:b/>
-                <w:sz w:val="19"/>
+                <w:sz w:val="18"/>
               </w:rPr>
-              <w:t>Baterías</w:t>
+              <w:t>🌱 Granja FV / agrivoltaica</w:t>
             </w:r>
           </w:p>
         </w:tc>
         <w:tc>
           <w:tcPr>
-            <w:tcW w:type="dxa" w:w="3400"/>
+            <w:tcW w:type="dxa" w:w="2062"/>
             <w:shd w:val="clear" w:color="auto" w:fill="E8F5E9"/>
           </w:tcPr>
           <w:p>
             <w:r>
               <w:rPr>
-                <w:sz w:val="19"/>
+                <w:sz w:val="18"/>
               </w:rPr>
-              <w:t>Balance horario consumo vs generación</w:t>
+              <w:t>130–250</w:t>
             </w:r>
           </w:p>
         </w:tc>
         <w:tc>
           <w:tcPr>
-            <w:tcW w:type="dxa" w:w="3400"/>
+            <w:tcW w:type="dxa" w:w="2062"/>
             <w:shd w:val="clear" w:color="auto" w:fill="E8F5E9"/>
           </w:tcPr>
           <w:p>
             <w:r>
               <w:rPr>
-                <w:sz w:val="19"/>
+                <w:sz w:val="18"/>
               </w:rPr>
-              <w:t>Autoconsumo y respaldo con catálogo real</w:t>
-            </w:r>
-          </w:p>
-        </w:tc>
-      </w:tr>
-      <w:tr>
-        <w:tc>
-          <w:tcPr>
-            <w:tcW w:type="dxa" w:w="3400"/>
-          </w:tcPr>
-          <w:p>
-            <w:r>
-              <w:rPr>
-                <w:b/>
-                <w:sz w:val="19"/>
-              </w:rPr>
-              <w:t>Financiero</w:t>
+              <w:t>0.80</w:t>
             </w:r>
           </w:p>
         </w:tc>
         <w:tc>
           <w:tcPr>
-            <w:tcW w:type="dxa" w:w="3400"/>
+            <w:tcW w:type="dxa" w:w="2062"/>
+            <w:shd w:val="clear" w:color="auto" w:fill="E8F5E9"/>
           </w:tcPr>
           <w:p>
             <w:r>
               <w:rPr>
-                <w:sz w:val="19"/>
+                <w:sz w:val="18"/>
               </w:rPr>
-              <w:t>Flujo de caja en COP, TRM en línea, precio real del inversor</w:t>
+              <w:t>15° (≈5°N Colombia)</w:t>
             </w:r>
           </w:p>
         </w:tc>
         <w:tc>
           <w:tcPr>
-            <w:tcW w:type="dxa" w:w="3400"/>
-          </w:tcPr>
-          <w:p>
-            <w:r>
-              <w:rPr>
-                <w:sz w:val="19"/>
-              </w:rPr>
-              <w:t>TIR, VPN, payback y LCOE bancables</w:t>
-            </w:r>
-          </w:p>
-        </w:tc>
-      </w:tr>
-      <w:tr>
-        <w:tc>
-          <w:tcPr>
-            <w:tcW w:type="dxa" w:w="3400"/>
+            <w:tcW w:type="dxa" w:w="2062"/>
             <w:shd w:val="clear" w:color="auto" w:fill="E8F5E9"/>
           </w:tcPr>
           <w:p>
             <w:r>
               <w:rPr>
-                <w:b/>
-                <w:sz w:val="19"/>
+                <w:sz w:val="18"/>
               </w:rPr>
-              <w:t>Entregables</w:t>
-            </w:r>
-          </w:p>
-        </w:tc>
-        <w:tc>
-          <w:tcPr>
-            <w:tcW w:type="dxa" w:w="3400"/>
-            <w:shd w:val="clear" w:color="auto" w:fill="E8F5E9"/>
-          </w:tcPr>
-          <w:p>
-            <w:r>
-              <w:rPr>
-                <w:sz w:val="19"/>
-              </w:rPr>
-              <w:t>Presupuesto bancable + Reporte PDF automático</w:t>
-            </w:r>
-          </w:p>
-        </w:tc>
-        <w:tc>
-          <w:tcPr>
-            <w:tcW w:type="dxa" w:w="3400"/>
-            <w:shd w:val="clear" w:color="auto" w:fill="E8F5E9"/>
-          </w:tcPr>
-          <w:p>
-            <w:r>
-              <w:rPr>
-                <w:sz w:val="19"/>
-              </w:rPr>
-              <w:t>Documento listo para cliente y banco</w:t>
+              <w:t>Ventilado + bifacial</w:t>
             </w:r>
           </w:p>
         </w:tc>
@@ -648,7 +631,7 @@
     </w:tbl>
     <w:p>
       <w:pPr>
-        <w:spacing w:after="40"/>
+        <w:spacing w:after="20"/>
       </w:pPr>
     </w:p>
     <w:tbl>
@@ -658,12 +641,12 @@
         <w:tblLook w:firstColumn="1" w:firstRow="1" w:lastColumn="0" w:lastRow="0" w:noHBand="0" w:noVBand="1" w:val="04A0"/>
       </w:tblPr>
       <w:tblGrid>
-        <w:gridCol w:w="10200"/>
+        <w:gridCol w:w="10312"/>
       </w:tblGrid>
       <w:tr>
         <w:tc>
           <w:tcPr>
-            <w:tcW w:type="dxa" w:w="10200"/>
+            <w:tcW w:type="dxa" w:w="10312"/>
             <w:shd w:val="clear" w:color="auto" w:fill="E8F5E9"/>
           </w:tcPr>
           <w:p>
@@ -671,16 +654,16 @@
               <w:rPr>
                 <w:b/>
                 <w:color w:val="1B5E20"/>
-                <w:sz w:val="21"/>
+                <w:sz w:val="20"/>
               </w:rPr>
-              <w:t xml:space="preserve">🎯 Argumento clave: </w:t>
+              <w:t xml:space="preserve">🌱 </w:t>
             </w:r>
             <w:r>
               <w:rPr>
                 <w:color w:val="1B5E20"/>
-                <w:sz w:val="21"/>
+                <w:sz w:val="20"/>
               </w:rPr>
-              <w:t>El PR (performance ratio) no se asume: se obtiene. La cadena óptica-eléctrica-térmica produce el PR como resultado físico del sitio y la tecnología — el número que un evaluador técnico puede auditar capa por capa.</w:t>
+              <w:t>Modo agrivoltaico completo: factor de ocupación configurable (5–100%) que dimensiona paneles y presupuesto sobre el área útil, sincroniza la separación entre filas (GCR) y muestra en Vista 3D las filas elevadas a 3 m sobre el cultivo. Validado con proyectos reales de cultivo bajo paneles en Colombia.</w:t>
             </w:r>
           </w:p>
         </w:tc>
@@ -688,7 +671,7 @@
     </w:tbl>
     <w:p>
       <w:pPr>
-        <w:spacing w:after="40"/>
+        <w:spacing w:after="20"/>
       </w:pPr>
     </w:p>
     <w:p>
@@ -701,20 +684,415 @@
           <w:color w:val="0D47A1"/>
           <w:sz w:val="26"/>
         </w:rPr>
-        <w:t>3. Catálogos inteligentes — cero digitación manual</w:t>
+        <w:t>2. Motores de cálculo — la diferencia entre estimar y simular</w:t>
       </w:r>
     </w:p>
     <w:p>
       <w:pPr>
-        <w:spacing w:after="120"/>
+        <w:spacing w:after="40"/>
+      </w:pPr>
+      <w:r>
+        <w:rPr>
+          <w:b/>
+          <w:color w:val="1B5E20"/>
+          <w:sz w:val="20"/>
+        </w:rPr>
+        <w:t>☀️ Recurso solar hora a hora (8 760 iteraciones/año)</w:t>
+      </w:r>
+    </w:p>
+    <w:p>
+      <w:pPr>
+        <w:spacing w:after="100"/>
       </w:pPr>
       <w:r>
         <w:rPr>
           <w:b w:val="0"/>
-          <w:sz w:val="21"/>
+          <w:sz w:val="20"/>
         </w:rPr>
-        <w:t>Los catálogos de paneles, inversores y baterías se alimentan directamente desde la ficha técnica PDF del fabricante: un extractor con banco de regresión de 84 casos reales lee Voc, Isc, coeficientes térmicos, número de celdas, bifacialidad y ventanas MPPT, y un validador físico rechaza valores imposibles antes de que contaminen la simulación. Soporta fichas multi-modelo (un PDF, varios equipos).</w:t>
+        <w:t>Archivos climáticos TMY/EPW reales del sitio + transposición Hay-Davies al plano exacto de instalación. Para bifaciales y agrivoltaica, modelo infinite_sheds de pvlib (estándar NREL) que calcula la luz que llega a la cara trasera según la separación real entre filas. El reporte declara la ganancia bifacial anual (%) con altura de montaje y albedo — el banco ve de dónde sale cada kWh extra.</w:t>
       </w:r>
+    </w:p>
+    <w:p>
+      <w:pPr>
+        <w:spacing w:after="40"/>
+      </w:pPr>
+      <w:r>
+        <w:rPr>
+          <w:b/>
+          <w:color w:val="1B5E20"/>
+          <w:sz w:val="20"/>
+        </w:rPr>
+        <w:t>⚡ Motor IV — curva corriente-voltaje real, no regla de tres</w:t>
+      </w:r>
+    </w:p>
+    <w:p>
+      <w:pPr>
+        <w:spacing w:after="100"/>
+      </w:pPr>
+      <w:r>
+        <w:rPr>
+          <w:b w:val="0"/>
+          <w:sz w:val="20"/>
+        </w:rPr>
+        <w:t>Resuelve el modelo de diodo único del panel en cada condición de irradiancia y temperatura, con Voc, Isc, Vmp, Imp y coeficientes térmicos de la ficha real del fabricante. Se activa automáticamente con ficha completa e incluye triple defensa contra el error más común del mercado: el conteo de celdas en paneles half-cut (verificación física Ns ≈ Voc/0.74).</w:t>
+      </w:r>
+    </w:p>
+    <w:p>
+      <w:pPr>
+        <w:spacing w:after="40"/>
+      </w:pPr>
+      <w:r>
+        <w:rPr>
+          <w:b/>
+          <w:color w:val="1B5E20"/>
+          <w:sz w:val="20"/>
+        </w:rPr>
+        <w:t>🌗 Diodos de bypass — el cálculo que casi nadie hace</w:t>
+      </w:r>
+    </w:p>
+    <w:p>
+      <w:pPr>
+        <w:spacing w:after="100"/>
+      </w:pPr>
+      <w:r>
+        <w:rPr>
+          <w:b w:val="0"/>
+          <w:sz w:val="20"/>
+        </w:rPr>
+        <w:t>Cuando un obstáculo sombrea 2 de 8 módulos de un string, la pérdida real NO es 25%: puede ser 40–60% de la producción en esas horas, porque los diodos de bypass eliminan la tensión completa de los módulos sombreados. La Calculadora resuelve el circuito IV del string hora a hora con el factor de sombra geométrico del sitio (CSV de la Calculadora de Sombreado 3D) y entrega pérdida anual, horas de bypass activo y tabla mensual. Referencia técnica: Deline et al. 2013 (NREL).</w:t>
+      </w:r>
+    </w:p>
+    <w:tbl>
+      <w:tblPr>
+        <w:tblStyle w:val="TableGrid"/>
+        <w:tblW w:type="auto" w:w="0"/>
+        <w:jc w:val="center"/>
+        <w:tblLook w:firstColumn="1" w:firstRow="1" w:lastColumn="0" w:lastRow="0" w:noHBand="0" w:noVBand="1" w:val="04A0"/>
+      </w:tblPr>
+      <w:tblGrid>
+        <w:gridCol w:w="3437"/>
+        <w:gridCol w:w="3437"/>
+        <w:gridCol w:w="3437"/>
+      </w:tblGrid>
+      <w:tr>
+        <w:tc>
+          <w:tcPr>
+            <w:tcW w:type="dxa" w:w="3437"/>
+            <w:shd w:val="clear" w:color="auto" w:fill="1B5E20"/>
+          </w:tcPr>
+          <w:p>
+            <w:r>
+              <w:rPr>
+                <w:b/>
+                <w:color w:val="FFFFFF"/>
+                <w:sz w:val="19"/>
+              </w:rPr>
+              <w:t>Pérdida bypass anual</w:t>
+            </w:r>
+          </w:p>
+        </w:tc>
+        <w:tc>
+          <w:tcPr>
+            <w:tcW w:type="dxa" w:w="3437"/>
+            <w:shd w:val="clear" w:color="auto" w:fill="1B5E20"/>
+          </w:tcPr>
+          <w:p>
+            <w:r>
+              <w:rPr>
+                <w:b/>
+                <w:color w:val="FFFFFF"/>
+                <w:sz w:val="19"/>
+              </w:rPr>
+              <w:t>Diagnóstico</w:t>
+            </w:r>
+          </w:p>
+        </w:tc>
+        <w:tc>
+          <w:tcPr>
+            <w:tcW w:type="dxa" w:w="3437"/>
+            <w:shd w:val="clear" w:color="auto" w:fill="1B5E20"/>
+          </w:tcPr>
+          <w:p>
+            <w:r>
+              <w:rPr>
+                <w:b/>
+                <w:color w:val="FFFFFF"/>
+                <w:sz w:val="19"/>
+              </w:rPr>
+              <w:t>Acción sugerida</w:t>
+            </w:r>
+          </w:p>
+        </w:tc>
+      </w:tr>
+      <w:tr>
+        <w:tc>
+          <w:tcPr>
+            <w:tcW w:type="dxa" w:w="3437"/>
+          </w:tcPr>
+          <w:p>
+            <w:r>
+              <w:rPr>
+                <w:b/>
+                <w:sz w:val="18"/>
+              </w:rPr>
+              <w:t>&lt; 2%</w:t>
+            </w:r>
+          </w:p>
+        </w:tc>
+        <w:tc>
+          <w:tcPr>
+            <w:tcW w:type="dxa" w:w="3437"/>
+          </w:tcPr>
+          <w:p>
+            <w:r>
+              <w:rPr>
+                <w:sz w:val="18"/>
+              </w:rPr>
+              <w:t>🟢 Bajo</w:t>
+            </w:r>
+          </w:p>
+        </w:tc>
+        <w:tc>
+          <w:tcPr>
+            <w:tcW w:type="dxa" w:w="3437"/>
+          </w:tcPr>
+          <w:p>
+            <w:r>
+              <w:rPr>
+                <w:sz w:val="18"/>
+              </w:rPr>
+              <w:t>Sombras leves — diseño aprobado</w:t>
+            </w:r>
+          </w:p>
+        </w:tc>
+      </w:tr>
+      <w:tr>
+        <w:tc>
+          <w:tcPr>
+            <w:tcW w:type="dxa" w:w="3437"/>
+            <w:shd w:val="clear" w:color="auto" w:fill="E8F5E9"/>
+          </w:tcPr>
+          <w:p>
+            <w:r>
+              <w:rPr>
+                <w:b/>
+                <w:sz w:val="18"/>
+              </w:rPr>
+              <w:t>2–5%</w:t>
+            </w:r>
+          </w:p>
+        </w:tc>
+        <w:tc>
+          <w:tcPr>
+            <w:tcW w:type="dxa" w:w="3437"/>
+            <w:shd w:val="clear" w:color="auto" w:fill="E8F5E9"/>
+          </w:tcPr>
+          <w:p>
+            <w:r>
+              <w:rPr>
+                <w:sz w:val="18"/>
+              </w:rPr>
+              <w:t>🟡 Moderado</w:t>
+            </w:r>
+          </w:p>
+        </w:tc>
+        <w:tc>
+          <w:tcPr>
+            <w:tcW w:type="dxa" w:w="3437"/>
+            <w:shd w:val="clear" w:color="auto" w:fill="E8F5E9"/>
+          </w:tcPr>
+          <w:p>
+            <w:r>
+              <w:rPr>
+                <w:sz w:val="18"/>
+              </w:rPr>
+              <w:t>Considerar redistribución de strings</w:t>
+            </w:r>
+          </w:p>
+        </w:tc>
+      </w:tr>
+      <w:tr>
+        <w:tc>
+          <w:tcPr>
+            <w:tcW w:type="dxa" w:w="3437"/>
+          </w:tcPr>
+          <w:p>
+            <w:r>
+              <w:rPr>
+                <w:b/>
+                <w:sz w:val="18"/>
+              </w:rPr>
+              <w:t>5–10%</w:t>
+            </w:r>
+          </w:p>
+        </w:tc>
+        <w:tc>
+          <w:tcPr>
+            <w:tcW w:type="dxa" w:w="3437"/>
+          </w:tcPr>
+          <w:p>
+            <w:r>
+              <w:rPr>
+                <w:sz w:val="18"/>
+              </w:rPr>
+              <w:t>🔴 Alto</w:t>
+            </w:r>
+          </w:p>
+        </w:tc>
+        <w:tc>
+          <w:tcPr>
+            <w:tcW w:type="dxa" w:w="3437"/>
+          </w:tcPr>
+          <w:p>
+            <w:r>
+              <w:rPr>
+                <w:sz w:val="18"/>
+              </w:rPr>
+              <w:t>Evaluar cambio de orientación o layout</w:t>
+            </w:r>
+          </w:p>
+        </w:tc>
+      </w:tr>
+      <w:tr>
+        <w:tc>
+          <w:tcPr>
+            <w:tcW w:type="dxa" w:w="3437"/>
+            <w:shd w:val="clear" w:color="auto" w:fill="E8F5E9"/>
+          </w:tcPr>
+          <w:p>
+            <w:r>
+              <w:rPr>
+                <w:b/>
+                <w:sz w:val="18"/>
+              </w:rPr>
+              <w:t>&gt; 10%</w:t>
+            </w:r>
+          </w:p>
+        </w:tc>
+        <w:tc>
+          <w:tcPr>
+            <w:tcW w:type="dxa" w:w="3437"/>
+            <w:shd w:val="clear" w:color="auto" w:fill="E8F5E9"/>
+          </w:tcPr>
+          <w:p>
+            <w:r>
+              <w:rPr>
+                <w:sz w:val="18"/>
+              </w:rPr>
+              <w:t>⛔ Muy alto</w:t>
+            </w:r>
+          </w:p>
+        </w:tc>
+        <w:tc>
+          <w:tcPr>
+            <w:tcW w:type="dxa" w:w="3437"/>
+            <w:shd w:val="clear" w:color="auto" w:fill="E8F5E9"/>
+          </w:tcPr>
+          <w:p>
+            <w:r>
+              <w:rPr>
+                <w:sz w:val="18"/>
+              </w:rPr>
+              <w:t>Rediseño del sombreado — detectado ANTES de construir</w:t>
+            </w:r>
+          </w:p>
+        </w:tc>
+      </w:tr>
+    </w:tbl>
+    <w:p>
+      <w:pPr>
+        <w:spacing w:after="20"/>
+      </w:pPr>
+    </w:p>
+    <w:p>
+      <w:pPr>
+        <w:spacing w:after="40"/>
+      </w:pPr>
+      <w:r>
+        <w:rPr>
+          <w:b/>
+          <w:color w:val="1B5E20"/>
+          <w:sz w:val="20"/>
+        </w:rPr>
+        <w:t>🔬 Motor Óptico BIPV</w:t>
+      </w:r>
+    </w:p>
+    <w:p>
+      <w:pPr>
+        <w:spacing w:after="100"/>
+      </w:pPr>
+      <w:r>
+        <w:rPr>
+          <w:b w:val="0"/>
+          <w:sz w:val="20"/>
+        </w:rPr>
+        <w:t>Cascada completa de pérdidas que solo existen en integración arquitectónica: reflexión por ángulo de incidencia (IAM), suciedad (soiling) y efecto térmico del confinamiento en fachada (el panel confinado opera ~30% más caliente que en rack ventilado, k=1.3).</w:t>
+      </w:r>
+    </w:p>
+    <w:p>
+      <w:pPr>
+        <w:spacing w:after="40"/>
+      </w:pPr>
+      <w:r>
+        <w:rPr>
+          <w:b/>
+          <w:color w:val="1B5E20"/>
+          <w:sz w:val="20"/>
+        </w:rPr>
+        <w:t>🏢 Multi-superficie — el edificio completo en una simulación</w:t>
+      </w:r>
+    </w:p>
+    <w:p>
+      <w:pPr>
+        <w:spacing w:after="100"/>
+      </w:pPr>
+      <w:r>
+        <w:rPr>
+          <w:b w:val="0"/>
+          <w:sz w:val="20"/>
+        </w:rPr>
+        <w:t>Combina fachada sur + techo plano + pérgola + marquesina en un solo sistema: POA y producción por cada orientación, bypass individual por superficie y una E_ac total trazable que alimenta el financiero, las baterías y el cálculo de CO₂ evitado.</w:t>
+      </w:r>
+    </w:p>
+    <w:tbl>
+      <w:tblPr>
+        <w:tblW w:type="auto" w:w="0"/>
+        <w:jc w:val="center"/>
+        <w:tblLook w:firstColumn="1" w:firstRow="1" w:lastColumn="0" w:lastRow="0" w:noHBand="0" w:noVBand="1" w:val="04A0"/>
+      </w:tblPr>
+      <w:tblGrid>
+        <w:gridCol w:w="10312"/>
+      </w:tblGrid>
+      <w:tr>
+        <w:tc>
+          <w:tcPr>
+            <w:tcW w:type="dxa" w:w="10312"/>
+            <w:shd w:val="clear" w:color="auto" w:fill="E8F5E9"/>
+          </w:tcPr>
+          <w:p>
+            <w:r>
+              <w:rPr>
+                <w:b/>
+                <w:color w:val="1B5E20"/>
+                <w:sz w:val="20"/>
+              </w:rPr>
+              <w:t xml:space="preserve">🎯 Argumento clave: </w:t>
+            </w:r>
+            <w:r>
+              <w:rPr>
+                <w:color w:val="1B5E20"/>
+                <w:sz w:val="20"/>
+              </w:rPr>
+              <w:t>El Performance Ratio no se asume: se obtiene. La cadena óptica → térmica → eléctrica produce el PR como resultado físico del sitio. En Bogotá o Medellín puede superar el 100% (altitud y baja temperatura) — y la herramienta lo demuestra, capa por capa.</w:t>
+            </w:r>
+          </w:p>
+        </w:tc>
+      </w:tr>
+    </w:tbl>
+    <w:p>
+      <w:pPr>
+        <w:spacing w:after="20"/>
+      </w:pPr>
     </w:p>
     <w:p>
       <w:pPr>
@@ -726,7 +1104,19 @@
           <w:color w:val="0D47A1"/>
           <w:sz w:val="26"/>
         </w:rPr>
-        <w:t>4. Especificaciones generales</w:t>
+        <w:t>3. Análisis financiero bancable — Colombia, no genérico</w:t>
+      </w:r>
+    </w:p>
+    <w:p>
+      <w:pPr>
+        <w:spacing w:after="100"/>
+      </w:pPr>
+      <w:r>
+        <w:rPr>
+          <w:b w:val="0"/>
+          <w:sz w:val="20"/>
+        </w:rPr>
+        <w:t>TIR, VPN, Payback y LCOE calculados sobre flujo de caja en COP con TRM en línea, precio real del inversor del catálogo y los tres beneficios de la Ley 1715/2014: deducción de renta (Art. 11), exclusión de IVA sobre equipos (Art. 12) y depreciación acelerada (Art. 14).</w:t>
       </w:r>
     </w:p>
     <w:tbl>
@@ -737,13 +1127,15 @@
         <w:tblLook w:firstColumn="1" w:firstRow="1" w:lastColumn="0" w:lastRow="0" w:noHBand="0" w:noVBand="1" w:val="04A0"/>
       </w:tblPr>
       <w:tblGrid>
-        <w:gridCol w:w="5100"/>
-        <w:gridCol w:w="5100"/>
+        <w:gridCol w:w="2578"/>
+        <w:gridCol w:w="2578"/>
+        <w:gridCol w:w="2578"/>
+        <w:gridCol w:w="2578"/>
       </w:tblGrid>
       <w:tr>
         <w:tc>
           <w:tcPr>
-            <w:tcW w:type="dxa" w:w="5100"/>
+            <w:tcW w:type="dxa" w:w="2578"/>
             <w:shd w:val="clear" w:color="auto" w:fill="1B5E20"/>
           </w:tcPr>
           <w:p>
@@ -751,15 +1143,15 @@
               <w:rPr>
                 <w:b/>
                 <w:color w:val="FFFFFF"/>
-                <w:sz w:val="20"/>
+                <w:sz w:val="19"/>
               </w:rPr>
-              <w:t>Característica</w:t>
+              <w:t>Indicador</w:t>
             </w:r>
           </w:p>
         </w:tc>
         <w:tc>
           <w:tcPr>
-            <w:tcW w:type="dxa" w:w="5100"/>
+            <w:tcW w:type="dxa" w:w="2578"/>
             <w:shd w:val="clear" w:color="auto" w:fill="1B5E20"/>
           </w:tcPr>
           <w:p>
@@ -767,7 +1159,565 @@
               <w:rPr>
                 <w:b/>
                 <w:color w:val="FFFFFF"/>
-                <w:sz w:val="20"/>
+                <w:sz w:val="19"/>
+              </w:rPr>
+              <w:t>🟢 Atractivo</w:t>
+            </w:r>
+          </w:p>
+        </w:tc>
+        <w:tc>
+          <w:tcPr>
+            <w:tcW w:type="dxa" w:w="2578"/>
+            <w:shd w:val="clear" w:color="auto" w:fill="1B5E20"/>
+          </w:tcPr>
+          <w:p>
+            <w:r>
+              <w:rPr>
+                <w:b/>
+                <w:color w:val="FFFFFF"/>
+                <w:sz w:val="19"/>
+              </w:rPr>
+              <w:t>🟡 Aceptable</w:t>
+            </w:r>
+          </w:p>
+        </w:tc>
+        <w:tc>
+          <w:tcPr>
+            <w:tcW w:type="dxa" w:w="2578"/>
+            <w:shd w:val="clear" w:color="auto" w:fill="1B5E20"/>
+          </w:tcPr>
+          <w:p>
+            <w:r>
+              <w:rPr>
+                <w:b/>
+                <w:color w:val="FFFFFF"/>
+                <w:sz w:val="19"/>
+              </w:rPr>
+              <w:t>🔴 Revisar</w:t>
+            </w:r>
+          </w:p>
+        </w:tc>
+      </w:tr>
+      <w:tr>
+        <w:tc>
+          <w:tcPr>
+            <w:tcW w:type="dxa" w:w="2578"/>
+          </w:tcPr>
+          <w:p>
+            <w:r>
+              <w:rPr>
+                <w:b/>
+                <w:sz w:val="18"/>
+              </w:rPr>
+              <w:t>TIR</w:t>
+            </w:r>
+          </w:p>
+        </w:tc>
+        <w:tc>
+          <w:tcPr>
+            <w:tcW w:type="dxa" w:w="2578"/>
+          </w:tcPr>
+          <w:p>
+            <w:r>
+              <w:rPr>
+                <w:sz w:val="18"/>
+              </w:rPr>
+              <w:t>&gt; 12%</w:t>
+            </w:r>
+          </w:p>
+        </w:tc>
+        <w:tc>
+          <w:tcPr>
+            <w:tcW w:type="dxa" w:w="2578"/>
+          </w:tcPr>
+          <w:p>
+            <w:r>
+              <w:rPr>
+                <w:sz w:val="18"/>
+              </w:rPr>
+              <w:t>8–12%</w:t>
+            </w:r>
+          </w:p>
+        </w:tc>
+        <w:tc>
+          <w:tcPr>
+            <w:tcW w:type="dxa" w:w="2578"/>
+          </w:tcPr>
+          <w:p>
+            <w:r>
+              <w:rPr>
+                <w:sz w:val="18"/>
+              </w:rPr>
+              <w:t>&lt; 8%</w:t>
+            </w:r>
+          </w:p>
+        </w:tc>
+      </w:tr>
+      <w:tr>
+        <w:tc>
+          <w:tcPr>
+            <w:tcW w:type="dxa" w:w="2578"/>
+            <w:shd w:val="clear" w:color="auto" w:fill="E8F5E9"/>
+          </w:tcPr>
+          <w:p>
+            <w:r>
+              <w:rPr>
+                <w:b/>
+                <w:sz w:val="18"/>
+              </w:rPr>
+              <w:t>VPN</w:t>
+            </w:r>
+          </w:p>
+        </w:tc>
+        <w:tc>
+          <w:tcPr>
+            <w:tcW w:type="dxa" w:w="2578"/>
+            <w:shd w:val="clear" w:color="auto" w:fill="E8F5E9"/>
+          </w:tcPr>
+          <w:p>
+            <w:r>
+              <w:rPr>
+                <w:sz w:val="18"/>
+              </w:rPr>
+              <w:t>&gt; 0 USD</w:t>
+            </w:r>
+          </w:p>
+        </w:tc>
+        <w:tc>
+          <w:tcPr>
+            <w:tcW w:type="dxa" w:w="2578"/>
+            <w:shd w:val="clear" w:color="auto" w:fill="E8F5E9"/>
+          </w:tcPr>
+          <w:p>
+            <w:r>
+              <w:rPr>
+                <w:sz w:val="18"/>
+              </w:rPr>
+              <w:t>≈ 0</w:t>
+            </w:r>
+          </w:p>
+        </w:tc>
+        <w:tc>
+          <w:tcPr>
+            <w:tcW w:type="dxa" w:w="2578"/>
+            <w:shd w:val="clear" w:color="auto" w:fill="E8F5E9"/>
+          </w:tcPr>
+          <w:p>
+            <w:r>
+              <w:rPr>
+                <w:sz w:val="18"/>
+              </w:rPr>
+              <w:t>&lt; 0 USD</w:t>
+            </w:r>
+          </w:p>
+        </w:tc>
+      </w:tr>
+      <w:tr>
+        <w:tc>
+          <w:tcPr>
+            <w:tcW w:type="dxa" w:w="2578"/>
+          </w:tcPr>
+          <w:p>
+            <w:r>
+              <w:rPr>
+                <w:b/>
+                <w:sz w:val="18"/>
+              </w:rPr>
+              <w:t>Payback simple</w:t>
+            </w:r>
+          </w:p>
+        </w:tc>
+        <w:tc>
+          <w:tcPr>
+            <w:tcW w:type="dxa" w:w="2578"/>
+          </w:tcPr>
+          <w:p>
+            <w:r>
+              <w:rPr>
+                <w:sz w:val="18"/>
+              </w:rPr>
+              <w:t>&lt; 10 años</w:t>
+            </w:r>
+          </w:p>
+        </w:tc>
+        <w:tc>
+          <w:tcPr>
+            <w:tcW w:type="dxa" w:w="2578"/>
+          </w:tcPr>
+          <w:p>
+            <w:r>
+              <w:rPr>
+                <w:sz w:val="18"/>
+              </w:rPr>
+              <w:t>10–15 años</w:t>
+            </w:r>
+          </w:p>
+        </w:tc>
+        <w:tc>
+          <w:tcPr>
+            <w:tcW w:type="dxa" w:w="2578"/>
+          </w:tcPr>
+          <w:p>
+            <w:r>
+              <w:rPr>
+                <w:sz w:val="18"/>
+              </w:rPr>
+              <w:t>&gt; 15 años</w:t>
+            </w:r>
+          </w:p>
+        </w:tc>
+      </w:tr>
+      <w:tr>
+        <w:tc>
+          <w:tcPr>
+            <w:tcW w:type="dxa" w:w="2578"/>
+            <w:shd w:val="clear" w:color="auto" w:fill="E8F5E9"/>
+          </w:tcPr>
+          <w:p>
+            <w:r>
+              <w:rPr>
+                <w:b/>
+                <w:sz w:val="18"/>
+              </w:rPr>
+              <w:t>LCOE</w:t>
+            </w:r>
+          </w:p>
+        </w:tc>
+        <w:tc>
+          <w:tcPr>
+            <w:tcW w:type="dxa" w:w="2578"/>
+            <w:shd w:val="clear" w:color="auto" w:fill="E8F5E9"/>
+          </w:tcPr>
+          <w:p>
+            <w:r>
+              <w:rPr>
+                <w:sz w:val="18"/>
+              </w:rPr>
+              <w:t>&lt; tarifa red</w:t>
+            </w:r>
+          </w:p>
+        </w:tc>
+        <w:tc>
+          <w:tcPr>
+            <w:tcW w:type="dxa" w:w="2578"/>
+            <w:shd w:val="clear" w:color="auto" w:fill="E8F5E9"/>
+          </w:tcPr>
+          <w:p>
+            <w:r>
+              <w:rPr>
+                <w:sz w:val="18"/>
+              </w:rPr>
+              <w:t>≈ tarifa red</w:t>
+            </w:r>
+          </w:p>
+        </w:tc>
+        <w:tc>
+          <w:tcPr>
+            <w:tcW w:type="dxa" w:w="2578"/>
+            <w:shd w:val="clear" w:color="auto" w:fill="E8F5E9"/>
+          </w:tcPr>
+          <w:p>
+            <w:r>
+              <w:rPr>
+                <w:sz w:val="18"/>
+              </w:rPr>
+              <w:t>&gt; tarifa red</w:t>
+            </w:r>
+          </w:p>
+        </w:tc>
+      </w:tr>
+    </w:tbl>
+    <w:p>
+      <w:pPr>
+        <w:spacing w:after="20"/>
+      </w:pPr>
+    </w:p>
+    <w:p>
+      <w:pPr>
+        <w:spacing w:after="40"/>
+      </w:pPr>
+      <w:r>
+        <w:rPr>
+          <w:b/>
+          <w:color w:val="1B5E20"/>
+          <w:sz w:val="20"/>
+        </w:rPr>
+        <w:t>Estimación Rápida — rango de inversión en menos de 2 minutos</w:t>
+      </w:r>
+    </w:p>
+    <w:p>
+      <w:pPr>
+        <w:spacing w:after="100"/>
+      </w:pPr>
+      <w:r>
+        <w:rPr>
+          <w:b w:val="0"/>
+          <w:sz w:val="20"/>
+        </w:rPr>
+        <w:t>Benchmarks del mercado colombiano (julio 2026) por tipo de instalación, escenario económico (optimista/base/conservador) y factor de zona geográfica (Bogotá ×1.00 hasta Urabá/Chocó ×1.17). Desglosa CAPEX en equipos (55–65%), construcción (20–28%), costos blandos (8–14%) y contingencias, más OPEX anual de 5 componentes (O&amp;M, limpieza, fondo de reposición de inversor, monitoreo y seguro). Precisión declarada honestamente: ±25–35% — perfecta para decidir la factibilidad; las cotizaciones reales siempre tienen prioridad automática cuando se ingresan.</w:t>
+      </w:r>
+    </w:p>
+    <w:tbl>
+      <w:tblPr>
+        <w:tblStyle w:val="TableGrid"/>
+        <w:tblW w:type="auto" w:w="0"/>
+        <w:jc w:val="center"/>
+        <w:tblLook w:firstColumn="1" w:firstRow="1" w:lastColumn="0" w:lastRow="0" w:noHBand="0" w:noVBand="1" w:val="04A0"/>
+      </w:tblPr>
+      <w:tblGrid>
+        <w:gridCol w:w="3437"/>
+        <w:gridCol w:w="3437"/>
+        <w:gridCol w:w="3437"/>
+      </w:tblGrid>
+      <w:tr>
+        <w:tc>
+          <w:tcPr>
+            <w:tcW w:type="dxa" w:w="3437"/>
+            <w:shd w:val="clear" w:color="auto" w:fill="1B5E20"/>
+          </w:tcPr>
+          <w:p>
+            <w:r>
+              <w:rPr>
+                <w:b/>
+                <w:color w:val="FFFFFF"/>
+                <w:sz w:val="19"/>
+              </w:rPr>
+              <w:t>Tipo</w:t>
+            </w:r>
+          </w:p>
+        </w:tc>
+        <w:tc>
+          <w:tcPr>
+            <w:tcW w:type="dxa" w:w="3437"/>
+            <w:shd w:val="clear" w:color="auto" w:fill="1B5E20"/>
+          </w:tcPr>
+          <w:p>
+            <w:r>
+              <w:rPr>
+                <w:b/>
+                <w:color w:val="FFFFFF"/>
+                <w:sz w:val="19"/>
+              </w:rPr>
+              <w:t>CAPEX referencia (USD/Wp)</w:t>
+            </w:r>
+          </w:p>
+        </w:tc>
+        <w:tc>
+          <w:tcPr>
+            <w:tcW w:type="dxa" w:w="3437"/>
+            <w:shd w:val="clear" w:color="auto" w:fill="1B5E20"/>
+          </w:tcPr>
+          <w:p>
+            <w:r>
+              <w:rPr>
+                <w:b/>
+                <w:color w:val="FFFFFF"/>
+                <w:sz w:val="19"/>
+              </w:rPr>
+              <w:t>OPEX (USD/kWp·año)</w:t>
+            </w:r>
+          </w:p>
+        </w:tc>
+      </w:tr>
+      <w:tr>
+        <w:tc>
+          <w:tcPr>
+            <w:tcW w:type="dxa" w:w="3437"/>
+          </w:tcPr>
+          <w:p>
+            <w:r>
+              <w:rPr>
+                <w:b/>
+                <w:sz w:val="18"/>
+              </w:rPr>
+              <w:t>Granja FV en campo</w:t>
+            </w:r>
+          </w:p>
+        </w:tc>
+        <w:tc>
+          <w:tcPr>
+            <w:tcW w:type="dxa" w:w="3437"/>
+          </w:tcPr>
+          <w:p>
+            <w:r>
+              <w:rPr>
+                <w:sz w:val="18"/>
+              </w:rPr>
+              <w:t>0.70–1.10</w:t>
+            </w:r>
+          </w:p>
+        </w:tc>
+        <w:tc>
+          <w:tcPr>
+            <w:tcW w:type="dxa" w:w="3437"/>
+          </w:tcPr>
+          <w:p>
+            <w:r>
+              <w:rPr>
+                <w:sz w:val="18"/>
+              </w:rPr>
+              <w:t>8–12</w:t>
+            </w:r>
+          </w:p>
+        </w:tc>
+      </w:tr>
+      <w:tr>
+        <w:tc>
+          <w:tcPr>
+            <w:tcW w:type="dxa" w:w="3437"/>
+            <w:shd w:val="clear" w:color="auto" w:fill="E8F5E9"/>
+          </w:tcPr>
+          <w:p>
+            <w:r>
+              <w:rPr>
+                <w:b/>
+                <w:sz w:val="18"/>
+              </w:rPr>
+              <w:t>Techo industrial</w:t>
+            </w:r>
+          </w:p>
+        </w:tc>
+        <w:tc>
+          <w:tcPr>
+            <w:tcW w:type="dxa" w:w="3437"/>
+            <w:shd w:val="clear" w:color="auto" w:fill="E8F5E9"/>
+          </w:tcPr>
+          <w:p>
+            <w:r>
+              <w:rPr>
+                <w:sz w:val="18"/>
+              </w:rPr>
+              <w:t>0.90–1.45</w:t>
+            </w:r>
+          </w:p>
+        </w:tc>
+        <w:tc>
+          <w:tcPr>
+            <w:tcW w:type="dxa" w:w="3437"/>
+            <w:shd w:val="clear" w:color="auto" w:fill="E8F5E9"/>
+          </w:tcPr>
+          <w:p>
+            <w:r>
+              <w:rPr>
+                <w:sz w:val="18"/>
+              </w:rPr>
+              <w:t>6–12</w:t>
+            </w:r>
+          </w:p>
+        </w:tc>
+      </w:tr>
+      <w:tr>
+        <w:tc>
+          <w:tcPr>
+            <w:tcW w:type="dxa" w:w="3437"/>
+          </w:tcPr>
+          <w:p>
+            <w:r>
+              <w:rPr>
+                <w:b/>
+                <w:sz w:val="18"/>
+              </w:rPr>
+              <w:t>BIPV fachada / pérgola</w:t>
+            </w:r>
+          </w:p>
+        </w:tc>
+        <w:tc>
+          <w:tcPr>
+            <w:tcW w:type="dxa" w:w="3437"/>
+          </w:tcPr>
+          <w:p>
+            <w:r>
+              <w:rPr>
+                <w:sz w:val="18"/>
+              </w:rPr>
+              <w:t>1.60–3.20</w:t>
+            </w:r>
+          </w:p>
+        </w:tc>
+        <w:tc>
+          <w:tcPr>
+            <w:tcW w:type="dxa" w:w="3437"/>
+          </w:tcPr>
+          <w:p>
+            <w:r>
+              <w:rPr>
+                <w:sz w:val="18"/>
+              </w:rPr>
+              <w:t>10–16</w:t>
+            </w:r>
+          </w:p>
+        </w:tc>
+      </w:tr>
+    </w:tbl>
+    <w:p>
+      <w:pPr>
+        <w:spacing w:after="20"/>
+      </w:pPr>
+    </w:p>
+    <w:p>
+      <w:pPr>
+        <w:spacing w:after="80"/>
+      </w:pPr>
+      <w:r>
+        <w:rPr>
+          <w:b/>
+          <w:color w:val="0D47A1"/>
+          <w:sz w:val="26"/>
+        </w:rPr>
+        <w:t>4. Catálogos inteligentes — cero transcripción manual</w:t>
+      </w:r>
+    </w:p>
+    <w:p>
+      <w:pPr>
+        <w:spacing w:after="100"/>
+      </w:pPr>
+      <w:r>
+        <w:rPr>
+          <w:b w:val="0"/>
+          <w:sz w:val="20"/>
+        </w:rPr>
+        <w:t>Paneles, inversores y baterías se cargan arrastrando la ficha técnica PDF del fabricante. El extractor lee potencias, tensiones MPPT, corrientes por tracker, coeficientes térmicos, celdas y bifacialidad — incluso de fichas escaneadas (OCR), en español o inglés, con tablas multi-modelo (un PDF, varios equipos).</w:t>
+      </w:r>
+    </w:p>
+    <w:tbl>
+      <w:tblPr>
+        <w:tblStyle w:val="TableGrid"/>
+        <w:tblW w:type="auto" w:w="0"/>
+        <w:jc w:val="center"/>
+        <w:tblLook w:firstColumn="1" w:firstRow="1" w:lastColumn="0" w:lastRow="0" w:noHBand="0" w:noVBand="1" w:val="04A0"/>
+      </w:tblPr>
+      <w:tblGrid>
+        <w:gridCol w:w="5156"/>
+        <w:gridCol w:w="5156"/>
+      </w:tblGrid>
+      <w:tr>
+        <w:tc>
+          <w:tcPr>
+            <w:tcW w:type="dxa" w:w="5156"/>
+            <w:shd w:val="clear" w:color="auto" w:fill="1B5E20"/>
+          </w:tcPr>
+          <w:p>
+            <w:r>
+              <w:rPr>
+                <w:b/>
+                <w:color w:val="FFFFFF"/>
+                <w:sz w:val="19"/>
+              </w:rPr>
+              <w:t>Capacidad</w:t>
+            </w:r>
+          </w:p>
+        </w:tc>
+        <w:tc>
+          <w:tcPr>
+            <w:tcW w:type="dxa" w:w="5156"/>
+            <w:shd w:val="clear" w:color="auto" w:fill="1B5E20"/>
+          </w:tcPr>
+          <w:p>
+            <w:r>
+              <w:rPr>
+                <w:b/>
+                <w:color w:val="FFFFFF"/>
+                <w:sz w:val="19"/>
               </w:rPr>
               <w:t>Detalle</w:t>
             </w:r>
@@ -777,13 +1727,292 @@
       <w:tr>
         <w:tc>
           <w:tcPr>
-            <w:tcW w:type="dxa" w:w="5100"/>
+            <w:tcW w:type="dxa" w:w="5156"/>
           </w:tcPr>
           <w:p>
             <w:r>
               <w:rPr>
                 <w:b/>
+                <w:sz w:val="18"/>
+              </w:rPr>
+              <w:t>Fabricantes de inversores reconocidos</w:t>
+            </w:r>
+          </w:p>
+        </w:tc>
+        <w:tc>
+          <w:tcPr>
+            <w:tcW w:type="dxa" w:w="5156"/>
+          </w:tcPr>
+          <w:p>
+            <w:r>
+              <w:rPr>
+                <w:sz w:val="18"/>
+              </w:rPr>
+              <w:t>20+: Growatt, Deye, Solis, Huawei, SMA, Fronius, GoodWe, Sungrow, Victron, SolarEdge, MUST, SolaX, LuxPower, POWEST y más</w:t>
+            </w:r>
+          </w:p>
+        </w:tc>
+      </w:tr>
+      <w:tr>
+        <w:tc>
+          <w:tcPr>
+            <w:tcW w:type="dxa" w:w="5156"/>
+            <w:shd w:val="clear" w:color="auto" w:fill="E8F5E9"/>
+          </w:tcPr>
+          <w:p>
+            <w:r>
+              <w:rPr>
+                <w:b/>
+                <w:sz w:val="18"/>
+              </w:rPr>
+              <w:t>Control de calidad automático</w:t>
+            </w:r>
+          </w:p>
+        </w:tc>
+        <w:tc>
+          <w:tcPr>
+            <w:tcW w:type="dxa" w:w="5156"/>
+            <w:shd w:val="clear" w:color="auto" w:fill="E8F5E9"/>
+          </w:tcPr>
+          <w:p>
+            <w:r>
+              <w:rPr>
+                <w:sz w:val="18"/>
+              </w:rPr>
+              <w:t>Validador físico que rechaza valores imposibles + detección de fallos silenciosos: ningún dato incompleto entra al catálogo sin aviso</w:t>
+            </w:r>
+          </w:p>
+        </w:tc>
+      </w:tr>
+      <w:tr>
+        <w:tc>
+          <w:tcPr>
+            <w:tcW w:type="dxa" w:w="5156"/>
+          </w:tcPr>
+          <w:p>
+            <w:r>
+              <w:rPr>
+                <w:b/>
+                <w:sz w:val="18"/>
+              </w:rPr>
+              <w:t>Verificación permanente</w:t>
+            </w:r>
+          </w:p>
+        </w:tc>
+        <w:tc>
+          <w:tcPr>
+            <w:tcW w:type="dxa" w:w="5156"/>
+          </w:tcPr>
+          <w:p>
+            <w:r>
+              <w:rPr>
+                <w:sz w:val="18"/>
+              </w:rPr>
+              <w:t>Banco de regresión de 84 fichas reales de paneles + 26 casos de inversores que corren antes de cada mejora</w:t>
+            </w:r>
+          </w:p>
+        </w:tc>
+      </w:tr>
+      <w:tr>
+        <w:tc>
+          <w:tcPr>
+            <w:tcW w:type="dxa" w:w="5156"/>
+            <w:shd w:val="clear" w:color="auto" w:fill="E8F5E9"/>
+          </w:tcPr>
+          <w:p>
+            <w:r>
+              <w:rPr>
+                <w:b/>
+                <w:sz w:val="18"/>
+              </w:rPr>
+              <w:t>Emparejamiento panel-inversor</w:t>
+            </w:r>
+          </w:p>
+        </w:tc>
+        <w:tc>
+          <w:tcPr>
+            <w:tcW w:type="dxa" w:w="5156"/>
+            <w:shd w:val="clear" w:color="auto" w:fill="E8F5E9"/>
+          </w:tcPr>
+          <w:p>
+            <w:r>
+              <w:rPr>
+                <w:sz w:val="18"/>
+              </w:rPr>
+              <w:t>Motor automático que verifica ventanas MPPT, ratios DC/AC y compatibilidad eléctrica del arreglo</w:t>
+            </w:r>
+          </w:p>
+        </w:tc>
+      </w:tr>
+    </w:tbl>
+    <w:p>
+      <w:pPr>
+        <w:spacing w:after="20"/>
+      </w:pPr>
+    </w:p>
+    <w:p>
+      <w:pPr>
+        <w:spacing w:after="80"/>
+      </w:pPr>
+      <w:r>
+        <w:rPr>
+          <w:b/>
+          <w:color w:val="0D47A1"/>
+          <w:sz w:val="26"/>
+        </w:rPr>
+        <w:t>5. Entregables con trazabilidad total</w:t>
+      </w:r>
+    </w:p>
+    <w:p>
+      <w:pPr>
+        <w:spacing w:after="100"/>
+      </w:pPr>
+      <w:r>
+        <w:rPr>
+          <w:b w:val="0"/>
+          <w:sz w:val="20"/>
+        </w:rPr>
+        <w:t>El Reporte PDF ejecutivo incluye hasta 11 secciones seleccionables: proyecto, recurso solar, motor óptico, producción con diagnóstico PR real vs esperado, bypass diodes con semáforo de impacto, desglose multi-superficie, financiero, costos con KPIs de bancabilidad (USD/Wp, USD/m², OPEX/CAPEX), balance con baterías y CO₂ evitado.</w:t>
+      </w:r>
+    </w:p>
+    <w:tbl>
+      <w:tblPr>
+        <w:tblW w:type="auto" w:w="0"/>
+        <w:jc w:val="center"/>
+        <w:tblLook w:firstColumn="1" w:firstRow="1" w:lastColumn="0" w:lastRow="0" w:noHBand="0" w:noVBand="1" w:val="04A0"/>
+      </w:tblPr>
+      <w:tblGrid>
+        <w:gridCol w:w="10312"/>
+      </w:tblGrid>
+      <w:tr>
+        <w:tc>
+          <w:tcPr>
+            <w:tcW w:type="dxa" w:w="10312"/>
+            <w:shd w:val="clear" w:color="auto" w:fill="FFF3E0"/>
+          </w:tcPr>
+          <w:p>
+            <w:r>
+              <w:rPr>
+                <w:b/>
+                <w:color w:val="E65100"/>
+                <w:sz w:val="20"/>
+              </w:rPr>
+              <w:t xml:space="preserve">🔍 Trazabilidad: </w:t>
+            </w:r>
+            <w:r>
+              <w:rPr>
+                <w:color w:val="E65100"/>
+                <w:sz w:val="20"/>
+              </w:rPr>
+              <w:t>Cada reporte declara explícitamente qué energía se usó y por qué — por ejemplo: "E_ac usada: 88 150 kWh/año (corregida por bypass diodes; pérdida descontada: 2 850 kWh/año)". El cliente, el banco o la UPME pueden verificar que las cifras son conservadoras, no optimistas.</w:t>
+            </w:r>
+          </w:p>
+        </w:tc>
+      </w:tr>
+    </w:tbl>
+    <w:p>
+      <w:pPr>
+        <w:spacing w:after="20"/>
+      </w:pPr>
+    </w:p>
+    <w:p>
+      <w:pPr>
+        <w:spacing w:after="80"/>
+      </w:pPr>
+      <w:r>
+        <w:rPr>
+          <w:b/>
+          <w:color w:val="0D47A1"/>
+          <w:sz w:val="26"/>
+        </w:rPr>
+        <w:t>6. Especificaciones generales</w:t>
+      </w:r>
+    </w:p>
+    <w:tbl>
+      <w:tblPr>
+        <w:tblStyle w:val="TableGrid"/>
+        <w:tblW w:type="auto" w:w="0"/>
+        <w:jc w:val="center"/>
+        <w:tblLook w:firstColumn="1" w:firstRow="1" w:lastColumn="0" w:lastRow="0" w:noHBand="0" w:noVBand="1" w:val="04A0"/>
+      </w:tblPr>
+      <w:tblGrid>
+        <w:gridCol w:w="5156"/>
+        <w:gridCol w:w="5156"/>
+      </w:tblGrid>
+      <w:tr>
+        <w:tc>
+          <w:tcPr>
+            <w:tcW w:type="dxa" w:w="5156"/>
+            <w:shd w:val="clear" w:color="auto" w:fill="1B5E20"/>
+          </w:tcPr>
+          <w:p>
+            <w:r>
+              <w:rPr>
+                <w:b/>
+                <w:color w:val="FFFFFF"/>
                 <w:sz w:val="19"/>
+              </w:rPr>
+              <w:t>Característica</w:t>
+            </w:r>
+          </w:p>
+        </w:tc>
+        <w:tc>
+          <w:tcPr>
+            <w:tcW w:type="dxa" w:w="5156"/>
+            <w:shd w:val="clear" w:color="auto" w:fill="1B5E20"/>
+          </w:tcPr>
+          <w:p>
+            <w:r>
+              <w:rPr>
+                <w:b/>
+                <w:color w:val="FFFFFF"/>
+                <w:sz w:val="19"/>
+              </w:rPr>
+              <w:t>Detalle</w:t>
+            </w:r>
+          </w:p>
+        </w:tc>
+      </w:tr>
+      <w:tr>
+        <w:tc>
+          <w:tcPr>
+            <w:tcW w:type="dxa" w:w="5156"/>
+          </w:tcPr>
+          <w:p>
+            <w:r>
+              <w:rPr>
+                <w:b/>
+                <w:sz w:val="18"/>
+              </w:rPr>
+              <w:t>Resolución temporal</w:t>
+            </w:r>
+          </w:p>
+        </w:tc>
+        <w:tc>
+          <w:tcPr>
+            <w:tcW w:type="dxa" w:w="5156"/>
+          </w:tcPr>
+          <w:p>
+            <w:r>
+              <w:rPr>
+                <w:sz w:val="18"/>
+              </w:rPr>
+              <w:t>Horaria — 8 760 horas por año meteorológico típico (TMY/EPW)</w:t>
+            </w:r>
+          </w:p>
+        </w:tc>
+      </w:tr>
+      <w:tr>
+        <w:tc>
+          <w:tcPr>
+            <w:tcW w:type="dxa" w:w="5156"/>
+            <w:shd w:val="clear" w:color="auto" w:fill="E8F5E9"/>
+          </w:tcPr>
+          <w:p>
+            <w:r>
+              <w:rPr>
+                <w:b/>
+                <w:sz w:val="18"/>
               </w:rPr>
               <w:t>Tipos de instalación</w:t>
             </w:r>
@@ -791,14 +2020,15 @@
         </w:tc>
         <w:tc>
           <w:tcPr>
-            <w:tcW w:type="dxa" w:w="5100"/>
+            <w:tcW w:type="dxa" w:w="5156"/>
+            <w:shd w:val="clear" w:color="auto" w:fill="E8F5E9"/>
           </w:tcPr>
           <w:p>
             <w:r>
               <w:rPr>
-                <w:sz w:val="19"/>
+                <w:sz w:val="18"/>
               </w:rPr>
-              <w:t>Fachada BIPV, techo inclinado, techo plano, pérgola, marquesina, granja fotovoltaica/agrivoltaica</w:t>
+              <w:t>6: fachada, techo inclinado, techo plano, pérgola, marquesina, granja FV/agrivoltaica</w:t>
             </w:r>
           </w:p>
         </w:tc>
@@ -806,30 +2036,28 @@
       <w:tr>
         <w:tc>
           <w:tcPr>
-            <w:tcW w:type="dxa" w:w="5100"/>
-            <w:shd w:val="clear" w:color="auto" w:fill="E8F5E9"/>
+            <w:tcW w:type="dxa" w:w="5156"/>
           </w:tcPr>
           <w:p>
             <w:r>
               <w:rPr>
                 <w:b/>
-                <w:sz w:val="19"/>
+                <w:sz w:val="18"/>
               </w:rPr>
-              <w:t>Resolución temporal</w:t>
+              <w:t>Multi-superficie</w:t>
             </w:r>
           </w:p>
         </w:tc>
         <w:tc>
           <w:tcPr>
-            <w:tcW w:type="dxa" w:w="5100"/>
-            <w:shd w:val="clear" w:color="auto" w:fill="E8F5E9"/>
+            <w:tcW w:type="dxa" w:w="5156"/>
           </w:tcPr>
           <w:p>
             <w:r>
               <w:rPr>
-                <w:sz w:val="19"/>
+                <w:sz w:val="18"/>
               </w:rPr>
-              <w:t>Horaria — 8 760 horas por año típico meteorológico</w:t>
+              <w:t>Ilimitadas orientaciones combinadas con bypass individual por superficie</w:t>
             </w:r>
           </w:p>
         </w:tc>
@@ -837,28 +2065,30 @@
       <w:tr>
         <w:tc>
           <w:tcPr>
-            <w:tcW w:type="dxa" w:w="5100"/>
+            <w:tcW w:type="dxa" w:w="5156"/>
+            <w:shd w:val="clear" w:color="auto" w:fill="E8F5E9"/>
           </w:tcPr>
           <w:p>
             <w:r>
               <w:rPr>
                 <w:b/>
-                <w:sz w:val="19"/>
+                <w:sz w:val="18"/>
               </w:rPr>
-              <w:t>Multi-superficie</w:t>
+              <w:t>Baterías</w:t>
             </w:r>
           </w:p>
         </w:tc>
         <w:tc>
           <w:tcPr>
-            <w:tcW w:type="dxa" w:w="5100"/>
+            <w:tcW w:type="dxa" w:w="5156"/>
+            <w:shd w:val="clear" w:color="auto" w:fill="E8F5E9"/>
           </w:tcPr>
           <w:p>
             <w:r>
               <w:rPr>
-                <w:sz w:val="19"/>
+                <w:sz w:val="18"/>
               </w:rPr>
-              <w:t>Combina fachada + techo + pérgola en un solo sistema (Vista 3D)</w:t>
+              <w:t>Balance horario consumo vs generación: autogeneración, autosuficiencia, excedentes y dimensionamiento recomendado</w:t>
             </w:r>
           </w:p>
         </w:tc>
@@ -866,30 +2096,28 @@
       <w:tr>
         <w:tc>
           <w:tcPr>
-            <w:tcW w:type="dxa" w:w="5100"/>
-            <w:shd w:val="clear" w:color="auto" w:fill="E8F5E9"/>
+            <w:tcW w:type="dxa" w:w="5156"/>
           </w:tcPr>
           <w:p>
             <w:r>
               <w:rPr>
                 <w:b/>
-                <w:sz w:val="19"/>
+                <w:sz w:val="18"/>
               </w:rPr>
-              <w:t>Moneda y mercado</w:t>
+              <w:t>Moneda y normativa</w:t>
             </w:r>
           </w:p>
         </w:tc>
         <w:tc>
           <w:tcPr>
-            <w:tcW w:type="dxa" w:w="5100"/>
-            <w:shd w:val="clear" w:color="auto" w:fill="E8F5E9"/>
+            <w:tcW w:type="dxa" w:w="5156"/>
           </w:tcPr>
           <w:p>
             <w:r>
               <w:rPr>
-                <w:sz w:val="19"/>
+                <w:sz w:val="18"/>
               </w:rPr>
-              <w:t>COP con TRM en línea; costos de referencia del mercado colombiano</w:t>
+              <w:t>COP con TRM en línea · Ley 1715/2014 (Arts. 11, 12, 14) · RETIE/UPME en costos blandos</w:t>
             </w:r>
           </w:p>
         </w:tc>
@@ -897,28 +2125,30 @@
       <w:tr>
         <w:tc>
           <w:tcPr>
-            <w:tcW w:type="dxa" w:w="5100"/>
+            <w:tcW w:type="dxa" w:w="5156"/>
+            <w:shd w:val="clear" w:color="auto" w:fill="E8F5E9"/>
           </w:tcPr>
           <w:p>
             <w:r>
               <w:rPr>
                 <w:b/>
-                <w:sz w:val="19"/>
+                <w:sz w:val="18"/>
               </w:rPr>
-              <w:t>Entregables</w:t>
+              <w:t>Base científica</w:t>
             </w:r>
           </w:p>
         </w:tc>
         <w:tc>
           <w:tcPr>
-            <w:tcW w:type="dxa" w:w="5100"/>
+            <w:tcW w:type="dxa" w:w="5156"/>
+            <w:shd w:val="clear" w:color="auto" w:fill="E8F5E9"/>
           </w:tcPr>
           <w:p>
             <w:r>
               <w:rPr>
-                <w:sz w:val="19"/>
+                <w:sz w:val="18"/>
               </w:rPr>
-              <w:t>Reporte PDF ejecutivo, presupuesto bancable, cotización exportable</w:t>
+              <w:t>pvlib (NREL, estándar de la industria) + modelos propios BIPV + Deline et al. 2013 para bypass</w:t>
             </w:r>
           </w:p>
         </w:tc>
@@ -926,14 +2156,13 @@
       <w:tr>
         <w:tc>
           <w:tcPr>
-            <w:tcW w:type="dxa" w:w="5100"/>
-            <w:shd w:val="clear" w:color="auto" w:fill="E8F5E9"/>
+            <w:tcW w:type="dxa" w:w="5156"/>
           </w:tcPr>
           <w:p>
             <w:r>
               <w:rPr>
                 <w:b/>
-                <w:sz w:val="19"/>
+                <w:sz w:val="18"/>
               </w:rPr>
               <w:t>Acceso</w:t>
             </w:r>
@@ -941,15 +2170,14 @@
         </w:tc>
         <w:tc>
           <w:tcPr>
-            <w:tcW w:type="dxa" w:w="5100"/>
-            <w:shd w:val="clear" w:color="auto" w:fill="E8F5E9"/>
+            <w:tcW w:type="dxa" w:w="5156"/>
           </w:tcPr>
           <w:p>
             <w:r>
               <w:rPr>
-                <w:sz w:val="19"/>
+                <w:sz w:val="18"/>
               </w:rPr>
-              <w:t>Aplicación web — sin instalación (calc.innovacionquimica.com.co)</w:t>
+              <w:t>Aplicación web, sin instalación — calc.innovacionquimica.com.co</w:t>
             </w:r>
           </w:p>
         </w:tc>
@@ -957,28 +2185,30 @@
       <w:tr>
         <w:tc>
           <w:tcPr>
-            <w:tcW w:type="dxa" w:w="5100"/>
+            <w:tcW w:type="dxa" w:w="5156"/>
+            <w:shd w:val="clear" w:color="auto" w:fill="E8F5E9"/>
           </w:tcPr>
           <w:p>
             <w:r>
               <w:rPr>
                 <w:b/>
-                <w:sz w:val="19"/>
+                <w:sz w:val="18"/>
               </w:rPr>
-              <w:t>Base científica</w:t>
+              <w:t>Ecosistema</w:t>
             </w:r>
           </w:p>
         </w:tc>
         <w:tc>
           <w:tcPr>
-            <w:tcW w:type="dxa" w:w="5100"/>
+            <w:tcW w:type="dxa" w:w="5156"/>
+            <w:shd w:val="clear" w:color="auto" w:fill="E8F5E9"/>
           </w:tcPr>
           <w:p>
             <w:r>
               <w:rPr>
-                <w:sz w:val="19"/>
+                <w:sz w:val="18"/>
               </w:rPr>
-              <w:t>pvlib (estándar de la industria fotovoltaica, NREL) + modelos propios BIPV</w:t>
+              <w:t>Integrada con la Calculadora de Sombreado 3D (bipv.innovacionquimica.com.co)</w:t>
             </w:r>
           </w:p>
         </w:tc>
@@ -986,7 +2216,7 @@
     </w:tbl>
     <w:p>
       <w:pPr>
-        <w:spacing w:after="40"/>
+        <w:spacing w:after="20"/>
       </w:pPr>
     </w:p>
     <w:tbl>
@@ -996,12 +2226,12 @@
         <w:tblLook w:firstColumn="1" w:firstRow="1" w:lastColumn="0" w:lastRow="0" w:noHBand="0" w:noVBand="1" w:val="04A0"/>
       </w:tblPr>
       <w:tblGrid>
-        <w:gridCol w:w="10200"/>
+        <w:gridCol w:w="10312"/>
       </w:tblGrid>
       <w:tr>
         <w:tc>
           <w:tcPr>
-            <w:tcW w:type="dxa" w:w="10200"/>
+            <w:tcW w:type="dxa" w:w="10312"/>
             <w:shd w:val="clear" w:color="auto" w:fill="ECEFF1"/>
           </w:tcPr>
           <w:p>
@@ -1009,16 +2239,16 @@
               <w:rPr>
                 <w:b/>
                 <w:color w:val="37474F"/>
-                <w:sz w:val="21"/>
+                <w:sz w:val="20"/>
               </w:rPr>
-              <w:t xml:space="preserve">👥 </w:t>
+              <w:t xml:space="preserve">👥 Diseñada para: </w:t>
             </w:r>
             <w:r>
               <w:rPr>
                 <w:color w:val="37474F"/>
-                <w:sz w:val="21"/>
+                <w:sz w:val="20"/>
               </w:rPr>
-              <w:t>Ideal para: desarrolladores inmobiliarios, arquitectos, EPCs, evaluadores de banca verde y proyectos agrivoltaicos que necesitan cifras defendibles — no promesas.</w:t>
+              <w:t>Para desarrolladores inmobiliarios, arquitectos, EPCs, banca verde y proyectos agrivoltaicos que necesitan cifras defendibles ante un comité de inversión — no promesas de folleto.</w:t>
             </w:r>
           </w:p>
         </w:tc>
@@ -1026,7 +2256,7 @@
     </w:tbl>
     <w:p>
       <w:pPr>
-        <w:spacing w:after="40"/>
+        <w:spacing w:after="20"/>
       </w:pPr>
     </w:p>
     <w:p>
@@ -1040,12 +2270,12 @@
           <w:color w:val="37474F"/>
           <w:sz w:val="17"/>
         </w:rPr>
-        <w:t>Ficha técnica — agosto de 2026 · Innovación Química</w:t>
+        <w:t>Ficha técnica — agosto de 2026 · Innovación Química · calc.innovacionquimica.com.co</w:t>
       </w:r>
     </w:p>
     <w:sectPr>
       <w:pgSz w:w="12240" w:h="15840"/>
-      <w:pgMar w:top="907" w:right="1020" w:bottom="907" w:left="1020" w:header="720" w:footer="720" w:gutter="0"/>
+      <w:pgMar w:top="850" w:right="964" w:bottom="850" w:left="964" w:header="720" w:footer="720" w:gutter="0"/>
       <w:cols w:space="720"/>
       <w:docGrid w:linePitch="360"/>
     </w:sectPr>
@@ -1418,7 +2648,7 @@
     <w:rsid w:val="00FC693F"/>
     <w:rPr>
       <w:rFonts w:ascii="Calibri" w:hAnsi="Calibri"/>
-      <w:sz w:val="21"/>
+      <w:sz w:val="20"/>
     </w:rPr>
   </w:style>
   <w:style w:type="paragraph" w:styleId="Header">

</xml_diff>